<commit_message>
Update SRS and test plan per mentor feedback
</commit_message>
<xml_diff>
--- a/01-Requirements/EspoCRM-SRS-v1.0.docx
+++ b/01-Requirements/EspoCRM-SRS-v1.0.docx
@@ -1,6 +1,6 @@
 
 <file path=word/document.xml><?xml version="1.0" encoding="utf-8"?>
-<w:document xmlns:wpc="http://schemas.microsoft.com/office/word/2010/wordprocessingCanvas" xmlns:cx="http://schemas.microsoft.com/office/drawing/2014/chartex" xmlns:cx1="http://schemas.microsoft.com/office/drawing/2015/9/8/chartex" xmlns:cx2="http://schemas.microsoft.com/office/drawing/2015/10/21/chartex" xmlns:cx3="http://schemas.microsoft.com/office/drawing/2016/5/9/chartex" xmlns:cx4="http://schemas.microsoft.com/office/drawing/2016/5/10/chartex" xmlns:cx5="http://schemas.microsoft.com/office/drawing/2016/5/11/chartex" xmlns:cx6="http://schemas.microsoft.com/office/drawing/2016/5/12/chartex" xmlns:cx7="http://schemas.microsoft.com/office/drawing/2016/5/13/chartex" xmlns:cx8="http://schemas.microsoft.com/office/drawing/2016/5/14/chartex" xmlns:mc="http://schemas.openxmlformats.org/markup-compatibility/2006" xmlns:aink="http://schemas.microsoft.com/office/drawing/2016/ink" xmlns:am3d="http://schemas.microsoft.com/office/drawing/2017/model3d" xmlns:o="urn:schemas-microsoft-com:office:office" xmlns:oel="http://schemas.microsoft.com/office/2019/extlst" xmlns:r="http://schemas.openxmlformats.org/officeDocument/2006/relationships" xmlns:m="http://schemas.openxmlformats.org/officeDocument/2006/math" xmlns:v="urn:schemas-microsoft-com:vml" xmlns:wp14="http://schemas.microsoft.com/office/word/2010/wordprocessingDrawing" xmlns:wp="http://schemas.openxmlformats.org/drawingml/2006/wordprocessingDrawing" xmlns:w10="urn:schemas-microsoft-com:office:word" xmlns:w="http://schemas.openxmlformats.org/wordprocessingml/2006/main" xmlns:w14="http://schemas.microsoft.com/office/word/2010/wordml" xmlns:w15="http://schemas.microsoft.com/office/word/2012/wordml" xmlns:w16cei="http://schemas.microsoft.com/office/word/2026/wordml/cei" xmlns:w16cex="http://schemas.microsoft.com/office/word/2018/wordml/cex" xmlns:w16cid="http://schemas.microsoft.com/office/word/2016/wordml/cid" xmlns:w16="http://schemas.microsoft.com/office/word/2018/wordml" xmlns:w16du="http://schemas.microsoft.com/office/word/2023/wordml/word16du" xmlns:w16sdtdh="http://schemas.microsoft.com/office/word/2020/wordml/sdtdatahash" xmlns:w16sdtfl="http://schemas.microsoft.com/office/word/2024/wordml/sdtformatlock" xmlns:w16se="http://schemas.microsoft.com/office/word/2015/wordml/symex" xmlns:wpg="http://schemas.microsoft.com/office/word/2010/wordprocessingGroup" xmlns:wpi="http://schemas.microsoft.com/office/word/2010/wordprocessingInk" xmlns:wne="http://schemas.microsoft.com/office/word/2006/wordml" xmlns:wps="http://schemas.microsoft.com/office/word/2010/wordprocessingShape" mc:Ignorable="w14 w15 w16se w16cid w16 w16cex w16sdtdh w16sdtfl w16du wp14">
+<w:document xmlns:wpc="http://schemas.microsoft.com/office/word/2010/wordprocessingCanvas" xmlns:cx="http://schemas.microsoft.com/office/drawing/2014/chartex" xmlns:cx1="http://schemas.microsoft.com/office/drawing/2015/9/8/chartex" xmlns:cx2="http://schemas.microsoft.com/office/drawing/2015/10/21/chartex" xmlns:cx3="http://schemas.microsoft.com/office/drawing/2016/5/9/chartex" xmlns:cx4="http://schemas.microsoft.com/office/drawing/2016/5/10/chartex" xmlns:cx5="http://schemas.microsoft.com/office/drawing/2016/5/11/chartex" xmlns:cx6="http://schemas.microsoft.com/office/drawing/2016/5/12/chartex" xmlns:cx7="http://schemas.microsoft.com/office/drawing/2016/5/13/chartex" xmlns:cx8="http://schemas.microsoft.com/office/drawing/2016/5/14/chartex" xmlns:mc="http://schemas.openxmlformats.org/markup-compatibility/2006" xmlns:aink="http://schemas.microsoft.com/office/drawing/2016/ink" xmlns:am3d="http://schemas.microsoft.com/office/drawing/2017/model3d" xmlns:o="urn:schemas-microsoft-com:office:office" xmlns:oel="http://schemas.microsoft.com/office/2019/extlst" xmlns:r="http://schemas.openxmlformats.org/officeDocument/2006/relationships" xmlns:m="http://schemas.openxmlformats.org/officeDocument/2006/math" xmlns:v="urn:schemas-microsoft-com:vml" xmlns:wp14="http://schemas.microsoft.com/office/word/2010/wordprocessingDrawing" xmlns:wp="http://schemas.openxmlformats.org/drawingml/2006/wordprocessingDrawing" xmlns:w10="urn:schemas-microsoft-com:office:word" xmlns:w="http://schemas.openxmlformats.org/wordprocessingml/2006/main" xmlns:w14="http://schemas.microsoft.com/office/word/2010/wordml" xmlns:w15="http://schemas.microsoft.com/office/word/2012/wordml" xmlns:w16cex="http://schemas.microsoft.com/office/word/2018/wordml/cex" xmlns:w16cid="http://schemas.microsoft.com/office/word/2016/wordml/cid" xmlns:w16="http://schemas.microsoft.com/office/word/2018/wordml" xmlns:w16du="http://schemas.microsoft.com/office/word/2023/wordml/word16du" xmlns:w16sdtdh="http://schemas.microsoft.com/office/word/2020/wordml/sdtdatahash" xmlns:w16sdtfl="http://schemas.microsoft.com/office/word/2024/wordml/sdtformatlock" xmlns:w16se="http://schemas.microsoft.com/office/word/2015/wordml/symex" xmlns:wpg="http://schemas.microsoft.com/office/word/2010/wordprocessingGroup" xmlns:wpi="http://schemas.microsoft.com/office/word/2010/wordprocessingInk" xmlns:wne="http://schemas.microsoft.com/office/word/2006/wordml" xmlns:wps="http://schemas.microsoft.com/office/word/2010/wordprocessingShape" mc:Ignorable="w14 w15 w16se w16cid w16 w16cex w16sdtdh w16sdtfl w16du wp14">
   <w:body>
     <w:p>
       <w:pPr>
@@ -19,7 +19,7 @@
           <w:sz w:val="48"/>
         </w:rPr>
         <w:br/>
-        <w:t>SOFTWARE REQUIREMENTS SPECIFICATION</w:t>
+        <w:t>SOFTWARE REQUIREMENT SPECIFICATION</w:t>
       </w:r>
       <w:r>
         <w:rPr>
@@ -42,7 +42,10 @@
       </w:pPr>
       <w:r>
         <w:br/>
-        <w:t>Version 1.1</w:t>
+        <w:t>Version 1.</w:t>
+      </w:r>
+      <w:r>
+        <w:t>0</w:t>
       </w:r>
       <w:r>
         <w:br/>
@@ -182,7 +185,10 @@
           </w:tcPr>
           <w:p>
             <w:r>
-              <w:t>1.1</w:t>
+              <w:t>1.</w:t>
+            </w:r>
+            <w:r>
+              <w:t>0</w:t>
             </w:r>
           </w:p>
         </w:tc>
@@ -313,38 +319,6 @@
           <w:p>
             <w:r>
               <w:t>1.0</w:t>
-            </w:r>
-          </w:p>
-        </w:tc>
-        <w:tc>
-          <w:tcPr>
-            <w:tcW w:w="3312" w:type="dxa"/>
-          </w:tcPr>
-          <w:p>
-            <w:r>
-              <w:t>22-Aug-2026</w:t>
-            </w:r>
-          </w:p>
-        </w:tc>
-        <w:tc>
-          <w:tcPr>
-            <w:tcW w:w="3312" w:type="dxa"/>
-          </w:tcPr>
-          <w:p>
-            <w:r>
-              <w:t>Initial project-specific requirements baseline</w:t>
-            </w:r>
-          </w:p>
-        </w:tc>
-      </w:tr>
-      <w:tr>
-        <w:tc>
-          <w:tcPr>
-            <w:tcW w:w="3312" w:type="dxa"/>
-          </w:tcPr>
-          <w:p>
-            <w:r>
-              <w:t>1.1</w:t>
             </w:r>
           </w:p>
         </w:tc>
@@ -423,6 +397,10 @@
     <w:p>
       <w:pPr>
         <w:pStyle w:val="ListBullet"/>
+        <w:numPr>
+          <w:ilvl w:val="0"/>
+          <w:numId w:val="11"/>
+        </w:numPr>
       </w:pPr>
       <w:r>
         <w:t>Login</w:t>
@@ -431,6 +409,10 @@
     <w:p>
       <w:pPr>
         <w:pStyle w:val="ListBullet"/>
+        <w:numPr>
+          <w:ilvl w:val="0"/>
+          <w:numId w:val="11"/>
+        </w:numPr>
       </w:pPr>
       <w:r>
         <w:t>Accounts</w:t>
@@ -439,6 +421,10 @@
     <w:p>
       <w:pPr>
         <w:pStyle w:val="ListBullet"/>
+        <w:numPr>
+          <w:ilvl w:val="0"/>
+          <w:numId w:val="11"/>
+        </w:numPr>
       </w:pPr>
       <w:r>
         <w:t>Contacts</w:t>
@@ -447,6 +433,10 @@
     <w:p>
       <w:pPr>
         <w:pStyle w:val="ListBullet"/>
+        <w:numPr>
+          <w:ilvl w:val="0"/>
+          <w:numId w:val="11"/>
+        </w:numPr>
       </w:pPr>
       <w:r>
         <w:t>Leads</w:t>
@@ -455,6 +445,10 @@
     <w:p>
       <w:pPr>
         <w:pStyle w:val="ListBullet"/>
+        <w:numPr>
+          <w:ilvl w:val="0"/>
+          <w:numId w:val="11"/>
+        </w:numPr>
       </w:pPr>
       <w:r>
         <w:t>Opportunities</w:t>
@@ -463,6 +457,10 @@
     <w:p>
       <w:pPr>
         <w:pStyle w:val="ListBullet"/>
+        <w:numPr>
+          <w:ilvl w:val="0"/>
+          <w:numId w:val="11"/>
+        </w:numPr>
       </w:pPr>
       <w:r>
         <w:t>Functional and negative testing applicable to the selected requirements</w:t>
@@ -471,6 +469,10 @@
     <w:p>
       <w:pPr>
         <w:pStyle w:val="ListBullet"/>
+        <w:numPr>
+          <w:ilvl w:val="0"/>
+          <w:numId w:val="11"/>
+        </w:numPr>
       </w:pPr>
       <w:r>
         <w:t>Traceability through existing Scenario and Test Case identifiers</w:t>
@@ -479,6 +481,10 @@
     <w:p>
       <w:pPr>
         <w:pStyle w:val="ListBullet"/>
+        <w:numPr>
+          <w:ilvl w:val="0"/>
+          <w:numId w:val="11"/>
+        </w:numPr>
       </w:pPr>
       <w:r>
         <w:t>Automation, API, SQL and Jenkins activities for the selected scope</w:t>
@@ -489,6 +495,7 @@
         <w:pStyle w:val="Heading2"/>
       </w:pPr>
     </w:p>
+    <w:p/>
     <w:p/>
     <w:p/>
     <w:p>
@@ -502,66 +509,29 @@
     </w:p>
     <w:p>
       <w:pPr>
-        <w:pStyle w:val="ListBullet"/>
+        <w:pStyle w:val="Heading2"/>
       </w:pPr>
       <w:r>
-        <w:t>Cases</w:t>
+        <w:rPr>
+          <w:rFonts w:ascii="Aptos" w:eastAsiaTheme="minorEastAsia" w:hAnsi="Aptos" w:cstheme="minorBidi"/>
+          <w:b w:val="0"/>
+          <w:bCs w:val="0"/>
+          <w:color w:val="auto"/>
+          <w:sz w:val="21"/>
+          <w:szCs w:val="22"/>
+        </w:rPr>
+        <w:t>The following areas are outside the scope of this project: the Cases, Tasks, Meetings, Calls, Calendar, and Reports modules, as well as any other EspoCRM modules not specifically included in the project scope. P</w:t>
       </w:r>
-    </w:p>
-    <w:p>
-      <w:pPr>
-        <w:pStyle w:val="ListBullet"/>
-      </w:pPr>
       <w:r>
-        <w:t>Tasks</w:t>
-      </w:r>
-    </w:p>
-    <w:p>
-      <w:pPr>
-        <w:pStyle w:val="ListBullet"/>
-      </w:pPr>
-      <w:r>
-        <w:t>Meetings</w:t>
-      </w:r>
-    </w:p>
-    <w:p>
-      <w:pPr>
-        <w:pStyle w:val="ListBullet"/>
-      </w:pPr>
-      <w:r>
-        <w:t>Calls</w:t>
-      </w:r>
-    </w:p>
-    <w:p>
-      <w:pPr>
-        <w:pStyle w:val="ListBullet"/>
-      </w:pPr>
-      <w:r>
-        <w:t>Calendar</w:t>
-      </w:r>
-    </w:p>
-    <w:p>
-      <w:pPr>
-        <w:pStyle w:val="ListBullet"/>
-      </w:pPr>
-      <w:r>
-        <w:t>Reports</w:t>
-      </w:r>
-    </w:p>
-    <w:p>
-      <w:pPr>
-        <w:pStyle w:val="ListBullet"/>
-      </w:pPr>
-      <w:r>
-        <w:t>Other EspoCRM modules not listed above</w:t>
-      </w:r>
-    </w:p>
-    <w:p>
-      <w:pPr>
-        <w:pStyle w:val="ListBullet"/>
-      </w:pPr>
-      <w:r>
-        <w:t>Production testing</w:t>
+        <w:rPr>
+          <w:rFonts w:ascii="Aptos" w:eastAsiaTheme="minorEastAsia" w:hAnsi="Aptos" w:cstheme="minorBidi"/>
+          <w:b w:val="0"/>
+          <w:bCs w:val="0"/>
+          <w:color w:val="auto"/>
+          <w:sz w:val="21"/>
+          <w:szCs w:val="22"/>
+        </w:rPr>
+        <w:t>roduction environment testing is also excluded from this project.</w:t>
       </w:r>
     </w:p>
     <w:p>
@@ -1523,8 +1493,176 @@
           </w:tcPr>
           <w:p>
             <w:r>
+              <w:t>FR-CON-011</w:t>
+            </w:r>
+          </w:p>
+        </w:tc>
+        <w:tc>
+          <w:tcPr>
+            <w:tcW w:w="3312" w:type="dxa"/>
+          </w:tcPr>
+          <w:p>
+            <w:r>
+              <w:t>Contacts</w:t>
+            </w:r>
+          </w:p>
+        </w:tc>
+        <w:tc>
+          <w:tcPr>
+            <w:tcW w:w="3312" w:type="dxa"/>
+          </w:tcPr>
+          <w:p/>
+        </w:tc>
+      </w:tr>
+      <w:tr>
+        <w:tc>
+          <w:tcPr>
+            <w:tcW w:w="3312" w:type="dxa"/>
+          </w:tcPr>
+          <w:p>
+            <w:r>
+              <w:t>FR-CON-012</w:t>
+            </w:r>
+          </w:p>
+        </w:tc>
+        <w:tc>
+          <w:tcPr>
+            <w:tcW w:w="3312" w:type="dxa"/>
+          </w:tcPr>
+          <w:p>
+            <w:r>
+              <w:t>Contacts</w:t>
+            </w:r>
+          </w:p>
+        </w:tc>
+        <w:tc>
+          <w:tcPr>
+            <w:tcW w:w="3312" w:type="dxa"/>
+          </w:tcPr>
+          <w:p/>
+        </w:tc>
+      </w:tr>
+      <w:tr>
+        <w:tc>
+          <w:tcPr>
+            <w:tcW w:w="3312" w:type="dxa"/>
+          </w:tcPr>
+          <w:p>
+            <w:r>
+              <w:t>FR-CON-013</w:t>
+            </w:r>
+          </w:p>
+        </w:tc>
+        <w:tc>
+          <w:tcPr>
+            <w:tcW w:w="3312" w:type="dxa"/>
+          </w:tcPr>
+          <w:p>
+            <w:r>
+              <w:t>Contacts</w:t>
+            </w:r>
+          </w:p>
+        </w:tc>
+        <w:tc>
+          <w:tcPr>
+            <w:tcW w:w="3312" w:type="dxa"/>
+          </w:tcPr>
+          <w:p/>
+        </w:tc>
+      </w:tr>
+      <w:tr>
+        <w:tc>
+          <w:tcPr>
+            <w:tcW w:w="3312" w:type="dxa"/>
+          </w:tcPr>
+          <w:p>
+            <w:r>
+              <w:t>FR-CON-014</w:t>
+            </w:r>
+          </w:p>
+        </w:tc>
+        <w:tc>
+          <w:tcPr>
+            <w:tcW w:w="3312" w:type="dxa"/>
+          </w:tcPr>
+          <w:p>
+            <w:r>
+              <w:t>Contacts</w:t>
+            </w:r>
+          </w:p>
+        </w:tc>
+        <w:tc>
+          <w:tcPr>
+            <w:tcW w:w="3312" w:type="dxa"/>
+          </w:tcPr>
+          <w:p/>
+        </w:tc>
+      </w:tr>
+      <w:tr>
+        <w:tc>
+          <w:tcPr>
+            <w:tcW w:w="3312" w:type="dxa"/>
+          </w:tcPr>
+          <w:p>
+            <w:r>
+              <w:t>FR-CON-015</w:t>
+            </w:r>
+          </w:p>
+        </w:tc>
+        <w:tc>
+          <w:tcPr>
+            <w:tcW w:w="3312" w:type="dxa"/>
+          </w:tcPr>
+          <w:p>
+            <w:r>
+              <w:t>Contacts</w:t>
+            </w:r>
+          </w:p>
+        </w:tc>
+        <w:tc>
+          <w:tcPr>
+            <w:tcW w:w="3312" w:type="dxa"/>
+          </w:tcPr>
+          <w:p/>
+        </w:tc>
+      </w:tr>
+      <w:tr>
+        <w:tc>
+          <w:tcPr>
+            <w:tcW w:w="3312" w:type="dxa"/>
+          </w:tcPr>
+          <w:p>
+            <w:r>
+              <w:t>FR-CON-016</w:t>
+            </w:r>
+          </w:p>
+        </w:tc>
+        <w:tc>
+          <w:tcPr>
+            <w:tcW w:w="3312" w:type="dxa"/>
+          </w:tcPr>
+          <w:p>
+            <w:r>
+              <w:t>Contacts</w:t>
+            </w:r>
+          </w:p>
+        </w:tc>
+        <w:tc>
+          <w:tcPr>
+            <w:tcW w:w="3312" w:type="dxa"/>
+          </w:tcPr>
+          <w:p/>
+        </w:tc>
+      </w:tr>
+      <w:tr>
+        <w:tc>
+          <w:tcPr>
+            <w:tcW w:w="3312" w:type="dxa"/>
+          </w:tcPr>
+          <w:p>
+            <w:r>
               <w:lastRenderedPageBreak/>
-              <w:t>FR-CON-011</w:t>
+              <w:t>FR-CON-017</w:t>
             </w:r>
           </w:p>
         </w:tc>
@@ -1552,7 +1690,7 @@
           </w:tcPr>
           <w:p>
             <w:r>
-              <w:t>FR-CON-012</w:t>
+              <w:t>FR-CON-018</w:t>
             </w:r>
           </w:p>
         </w:tc>
@@ -1580,7 +1718,7 @@
           </w:tcPr>
           <w:p>
             <w:r>
-              <w:t>FR-CON-013</w:t>
+              <w:t>FR-CON-019</w:t>
             </w:r>
           </w:p>
         </w:tc>
@@ -1608,7 +1746,7 @@
           </w:tcPr>
           <w:p>
             <w:r>
-              <w:t>FR-CON-014</w:t>
+              <w:t>FR-CON-020</w:t>
             </w:r>
           </w:p>
         </w:tc>
@@ -1636,7 +1774,7 @@
           </w:tcPr>
           <w:p>
             <w:r>
-              <w:t>FR-CON-015</w:t>
+              <w:t>FR-CON-021</w:t>
             </w:r>
           </w:p>
         </w:tc>
@@ -1664,7 +1802,7 @@
           </w:tcPr>
           <w:p>
             <w:r>
-              <w:t>FR-CON-016</w:t>
+              <w:t>FR-CON-022</w:t>
             </w:r>
           </w:p>
         </w:tc>
@@ -1692,7 +1830,7 @@
           </w:tcPr>
           <w:p>
             <w:r>
-              <w:t>FR-CON-017</w:t>
+              <w:t>FR-CON-023</w:t>
             </w:r>
           </w:p>
         </w:tc>
@@ -1720,7 +1858,7 @@
           </w:tcPr>
           <w:p>
             <w:r>
-              <w:t>FR-CON-018</w:t>
+              <w:t>FR-CON-024</w:t>
             </w:r>
           </w:p>
         </w:tc>
@@ -1748,7 +1886,7 @@
           </w:tcPr>
           <w:p>
             <w:r>
-              <w:t>FR-CON-019</w:t>
+              <w:t>FR-CON-025</w:t>
             </w:r>
           </w:p>
         </w:tc>
@@ -1776,7 +1914,7 @@
           </w:tcPr>
           <w:p>
             <w:r>
-              <w:t>FR-CON-020</w:t>
+              <w:t>FR-CON-026</w:t>
             </w:r>
           </w:p>
         </w:tc>
@@ -1804,7 +1942,7 @@
           </w:tcPr>
           <w:p>
             <w:r>
-              <w:t>FR-CON-021</w:t>
+              <w:t>FR-CON-027</w:t>
             </w:r>
           </w:p>
         </w:tc>
@@ -1832,7 +1970,7 @@
           </w:tcPr>
           <w:p>
             <w:r>
-              <w:t>FR-CON-022</w:t>
+              <w:t>FR-CON-028</w:t>
             </w:r>
           </w:p>
         </w:tc>
@@ -1860,7 +1998,7 @@
           </w:tcPr>
           <w:p>
             <w:r>
-              <w:t>FR-CON-023</w:t>
+              <w:t>FR-CON-029</w:t>
             </w:r>
           </w:p>
         </w:tc>
@@ -1888,7 +2026,7 @@
           </w:tcPr>
           <w:p>
             <w:r>
-              <w:t>FR-CON-024</w:t>
+              <w:t>FR-CON-030</w:t>
             </w:r>
           </w:p>
         </w:tc>
@@ -1916,7 +2054,7 @@
           </w:tcPr>
           <w:p>
             <w:r>
-              <w:t>FR-CON-025</w:t>
+              <w:t>FR-CON-004A</w:t>
             </w:r>
           </w:p>
         </w:tc>
@@ -1944,7 +2082,7 @@
           </w:tcPr>
           <w:p>
             <w:r>
-              <w:t>FR-CON-026</w:t>
+              <w:t>FR-CON-004B</w:t>
             </w:r>
           </w:p>
         </w:tc>
@@ -1972,17 +2110,17 @@
           </w:tcPr>
           <w:p>
             <w:r>
-              <w:t>FR-CON-027</w:t>
-            </w:r>
-          </w:p>
-        </w:tc>
-        <w:tc>
-          <w:tcPr>
-            <w:tcW w:w="3312" w:type="dxa"/>
-          </w:tcPr>
-          <w:p>
-            <w:r>
-              <w:t>Contacts</w:t>
+              <w:t>FR-LEAD-001</w:t>
+            </w:r>
+          </w:p>
+        </w:tc>
+        <w:tc>
+          <w:tcPr>
+            <w:tcW w:w="3312" w:type="dxa"/>
+          </w:tcPr>
+          <w:p>
+            <w:r>
+              <w:t>Leads</w:t>
             </w:r>
           </w:p>
         </w:tc>
@@ -2000,17 +2138,17 @@
           </w:tcPr>
           <w:p>
             <w:r>
-              <w:t>FR-CON-028</w:t>
-            </w:r>
-          </w:p>
-        </w:tc>
-        <w:tc>
-          <w:tcPr>
-            <w:tcW w:w="3312" w:type="dxa"/>
-          </w:tcPr>
-          <w:p>
-            <w:r>
-              <w:t>Contacts</w:t>
+              <w:t>FR-LEAD-002</w:t>
+            </w:r>
+          </w:p>
+        </w:tc>
+        <w:tc>
+          <w:tcPr>
+            <w:tcW w:w="3312" w:type="dxa"/>
+          </w:tcPr>
+          <w:p>
+            <w:r>
+              <w:t>Leads</w:t>
             </w:r>
           </w:p>
         </w:tc>
@@ -2028,17 +2166,17 @@
           </w:tcPr>
           <w:p>
             <w:r>
-              <w:t>FR-CON-029</w:t>
-            </w:r>
-          </w:p>
-        </w:tc>
-        <w:tc>
-          <w:tcPr>
-            <w:tcW w:w="3312" w:type="dxa"/>
-          </w:tcPr>
-          <w:p>
-            <w:r>
-              <w:t>Contacts</w:t>
+              <w:t>FR-LEAD-003</w:t>
+            </w:r>
+          </w:p>
+        </w:tc>
+        <w:tc>
+          <w:tcPr>
+            <w:tcW w:w="3312" w:type="dxa"/>
+          </w:tcPr>
+          <w:p>
+            <w:r>
+              <w:t>Leads</w:t>
             </w:r>
           </w:p>
         </w:tc>
@@ -2056,17 +2194,17 @@
           </w:tcPr>
           <w:p>
             <w:r>
-              <w:t>FR-CON-030</w:t>
-            </w:r>
-          </w:p>
-        </w:tc>
-        <w:tc>
-          <w:tcPr>
-            <w:tcW w:w="3312" w:type="dxa"/>
-          </w:tcPr>
-          <w:p>
-            <w:r>
-              <w:t>Contacts</w:t>
+              <w:t>FR-LEAD-004</w:t>
+            </w:r>
+          </w:p>
+        </w:tc>
+        <w:tc>
+          <w:tcPr>
+            <w:tcW w:w="3312" w:type="dxa"/>
+          </w:tcPr>
+          <w:p>
+            <w:r>
+              <w:t>Leads</w:t>
             </w:r>
           </w:p>
         </w:tc>
@@ -2084,17 +2222,17 @@
           </w:tcPr>
           <w:p>
             <w:r>
-              <w:t>FR-CON-004A</w:t>
-            </w:r>
-          </w:p>
-        </w:tc>
-        <w:tc>
-          <w:tcPr>
-            <w:tcW w:w="3312" w:type="dxa"/>
-          </w:tcPr>
-          <w:p>
-            <w:r>
-              <w:t>Contacts</w:t>
+              <w:t>FR-LEAD-005</w:t>
+            </w:r>
+          </w:p>
+        </w:tc>
+        <w:tc>
+          <w:tcPr>
+            <w:tcW w:w="3312" w:type="dxa"/>
+          </w:tcPr>
+          <w:p>
+            <w:r>
+              <w:t>Leads</w:t>
             </w:r>
           </w:p>
         </w:tc>
@@ -2112,17 +2250,17 @@
           </w:tcPr>
           <w:p>
             <w:r>
-              <w:t>FR-CON-004B</w:t>
-            </w:r>
-          </w:p>
-        </w:tc>
-        <w:tc>
-          <w:tcPr>
-            <w:tcW w:w="3312" w:type="dxa"/>
-          </w:tcPr>
-          <w:p>
-            <w:r>
-              <w:t>Contacts</w:t>
+              <w:t>FR-LEAD-006</w:t>
+            </w:r>
+          </w:p>
+        </w:tc>
+        <w:tc>
+          <w:tcPr>
+            <w:tcW w:w="3312" w:type="dxa"/>
+          </w:tcPr>
+          <w:p>
+            <w:r>
+              <w:t>Leads</w:t>
             </w:r>
           </w:p>
         </w:tc>
@@ -2140,7 +2278,7 @@
           </w:tcPr>
           <w:p>
             <w:r>
-              <w:t>FR-LEAD-001</w:t>
+              <w:t>FR-LEAD-007</w:t>
             </w:r>
           </w:p>
         </w:tc>
@@ -2168,7 +2306,7 @@
           </w:tcPr>
           <w:p>
             <w:r>
-              <w:t>FR-LEAD-002</w:t>
+              <w:t>FR-LEAD-008</w:t>
             </w:r>
           </w:p>
         </w:tc>
@@ -2196,7 +2334,7 @@
           </w:tcPr>
           <w:p>
             <w:r>
-              <w:t>FR-LEAD-003</w:t>
+              <w:t>FR-LEAD-009</w:t>
             </w:r>
           </w:p>
         </w:tc>
@@ -2224,7 +2362,7 @@
           </w:tcPr>
           <w:p>
             <w:r>
-              <w:t>FR-LEAD-004</w:t>
+              <w:t>FR-LEAD-010</w:t>
             </w:r>
           </w:p>
         </w:tc>
@@ -2252,7 +2390,7 @@
           </w:tcPr>
           <w:p>
             <w:r>
-              <w:t>FR-LEAD-005</w:t>
+              <w:t>FR-LEAD-011</w:t>
             </w:r>
           </w:p>
         </w:tc>
@@ -2280,7 +2418,7 @@
           </w:tcPr>
           <w:p>
             <w:r>
-              <w:t>FR-LEAD-006</w:t>
+              <w:t>FR-LEAD-012</w:t>
             </w:r>
           </w:p>
         </w:tc>
@@ -2308,7 +2446,7 @@
           </w:tcPr>
           <w:p>
             <w:r>
-              <w:t>FR-LEAD-007</w:t>
+              <w:t>FR-LEAD-013</w:t>
             </w:r>
           </w:p>
         </w:tc>
@@ -2336,7 +2474,7 @@
           </w:tcPr>
           <w:p>
             <w:r>
-              <w:t>FR-LEAD-008</w:t>
+              <w:t>FR-LEAD-014</w:t>
             </w:r>
           </w:p>
         </w:tc>
@@ -2364,7 +2502,7 @@
           </w:tcPr>
           <w:p>
             <w:r>
-              <w:t>FR-LEAD-009</w:t>
+              <w:t>FR-LEAD-015</w:t>
             </w:r>
           </w:p>
         </w:tc>
@@ -2392,7 +2530,7 @@
           </w:tcPr>
           <w:p>
             <w:r>
-              <w:t>FR-LEAD-010</w:t>
+              <w:t>FR-LEAD-016</w:t>
             </w:r>
           </w:p>
         </w:tc>
@@ -2420,7 +2558,7 @@
           </w:tcPr>
           <w:p>
             <w:r>
-              <w:t>FR-LEAD-011</w:t>
+              <w:t>FR-LEAD-017</w:t>
             </w:r>
           </w:p>
         </w:tc>
@@ -2448,7 +2586,7 @@
           </w:tcPr>
           <w:p>
             <w:r>
-              <w:t>FR-LEAD-012</w:t>
+              <w:t>FR-LEAD-018</w:t>
             </w:r>
           </w:p>
         </w:tc>
@@ -2476,7 +2614,7 @@
           </w:tcPr>
           <w:p>
             <w:r>
-              <w:t>FR-LEAD-013</w:t>
+              <w:t>FR-LEAD-019</w:t>
             </w:r>
           </w:p>
         </w:tc>
@@ -2504,7 +2642,7 @@
           </w:tcPr>
           <w:p>
             <w:r>
-              <w:t>FR-LEAD-014</w:t>
+              <w:t>FR-LEAD-020</w:t>
             </w:r>
           </w:p>
         </w:tc>
@@ -2532,7 +2670,7 @@
           </w:tcPr>
           <w:p>
             <w:r>
-              <w:t>FR-LEAD-015</w:t>
+              <w:t>FR-LEAD-021</w:t>
             </w:r>
           </w:p>
         </w:tc>
@@ -2560,7 +2698,7 @@
           </w:tcPr>
           <w:p>
             <w:r>
-              <w:t>FR-LEAD-016</w:t>
+              <w:t>FR-LEAD-022</w:t>
             </w:r>
           </w:p>
         </w:tc>
@@ -2588,7 +2726,7 @@
           </w:tcPr>
           <w:p>
             <w:r>
-              <w:t>FR-LEAD-017</w:t>
+              <w:t>FR-LEAD-023</w:t>
             </w:r>
           </w:p>
         </w:tc>
@@ -2616,7 +2754,7 @@
           </w:tcPr>
           <w:p>
             <w:r>
-              <w:t>FR-LEAD-018</w:t>
+              <w:t>FR-LEAD-024</w:t>
             </w:r>
           </w:p>
         </w:tc>
@@ -2644,7 +2782,7 @@
           </w:tcPr>
           <w:p>
             <w:r>
-              <w:t>FR-LEAD-019</w:t>
+              <w:t>FR-LEAD-025</w:t>
             </w:r>
           </w:p>
         </w:tc>
@@ -2672,7 +2810,7 @@
           </w:tcPr>
           <w:p>
             <w:r>
-              <w:t>FR-LEAD-020</w:t>
+              <w:t>FR-LEAD-026</w:t>
             </w:r>
           </w:p>
         </w:tc>
@@ -2700,7 +2838,7 @@
           </w:tcPr>
           <w:p>
             <w:r>
-              <w:t>FR-LEAD-021</w:t>
+              <w:t>FR-LEAD-027</w:t>
             </w:r>
           </w:p>
         </w:tc>
@@ -2728,7 +2866,7 @@
           </w:tcPr>
           <w:p>
             <w:r>
-              <w:t>FR-LEAD-022</w:t>
+              <w:t>FR-LEAD-028</w:t>
             </w:r>
           </w:p>
         </w:tc>
@@ -2756,7 +2894,7 @@
           </w:tcPr>
           <w:p>
             <w:r>
-              <w:t>FR-LEAD-023</w:t>
+              <w:t>FR-LEAD-029</w:t>
             </w:r>
           </w:p>
         </w:tc>
@@ -2784,7 +2922,7 @@
           </w:tcPr>
           <w:p>
             <w:r>
-              <w:t>FR-LEAD-024</w:t>
+              <w:t>FR-LEAD-030</w:t>
             </w:r>
           </w:p>
         </w:tc>
@@ -2812,7 +2950,7 @@
           </w:tcPr>
           <w:p>
             <w:r>
-              <w:t>FR-LEAD-025</w:t>
+              <w:t>FR-LEAD-031</w:t>
             </w:r>
           </w:p>
         </w:tc>
@@ -2840,7 +2978,7 @@
           </w:tcPr>
           <w:p>
             <w:r>
-              <w:t>FR-LEAD-026</w:t>
+              <w:t>FR-LEAD-032</w:t>
             </w:r>
           </w:p>
         </w:tc>
@@ -2868,7 +3006,7 @@
           </w:tcPr>
           <w:p>
             <w:r>
-              <w:t>FR-LEAD-027</w:t>
+              <w:t>FR-LEAD-033</w:t>
             </w:r>
           </w:p>
         </w:tc>
@@ -2896,7 +3034,7 @@
           </w:tcPr>
           <w:p>
             <w:r>
-              <w:t>FR-LEAD-028</w:t>
+              <w:t>FR-LEAD-034</w:t>
             </w:r>
           </w:p>
         </w:tc>
@@ -2924,7 +3062,7 @@
           </w:tcPr>
           <w:p>
             <w:r>
-              <w:t>FR-LEAD-029</w:t>
+              <w:t>FR-LEAD-035</w:t>
             </w:r>
           </w:p>
         </w:tc>
@@ -2953,7 +3091,7 @@
           <w:p>
             <w:r>
               <w:lastRenderedPageBreak/>
-              <w:t>FR-LEAD-030</w:t>
+              <w:t>FR-LEAD-036</w:t>
             </w:r>
           </w:p>
         </w:tc>
@@ -2981,7 +3119,7 @@
           </w:tcPr>
           <w:p>
             <w:r>
-              <w:t>FR-LEAD-031</w:t>
+              <w:t>FR-LEAD-037</w:t>
             </w:r>
           </w:p>
         </w:tc>
@@ -3009,7 +3147,7 @@
           </w:tcPr>
           <w:p>
             <w:r>
-              <w:t>FR-LEAD-032</w:t>
+              <w:t>FR-LEAD-038</w:t>
             </w:r>
           </w:p>
         </w:tc>
@@ -3037,7 +3175,7 @@
           </w:tcPr>
           <w:p>
             <w:r>
-              <w:t>FR-LEAD-033</w:t>
+              <w:t>FR-LEAD-039</w:t>
             </w:r>
           </w:p>
         </w:tc>
@@ -3065,7 +3203,7 @@
           </w:tcPr>
           <w:p>
             <w:r>
-              <w:t>FR-LEAD-034</w:t>
+              <w:t>FR-LEAD-040</w:t>
             </w:r>
           </w:p>
         </w:tc>
@@ -3093,7 +3231,7 @@
           </w:tcPr>
           <w:p>
             <w:r>
-              <w:t>FR-LEAD-035</w:t>
+              <w:t>FR-LEAD-041</w:t>
             </w:r>
           </w:p>
         </w:tc>
@@ -3121,7 +3259,7 @@
           </w:tcPr>
           <w:p>
             <w:r>
-              <w:t>FR-LEAD-036</w:t>
+              <w:t>FR-LEAD-042</w:t>
             </w:r>
           </w:p>
         </w:tc>
@@ -3149,7 +3287,7 @@
           </w:tcPr>
           <w:p>
             <w:r>
-              <w:t>FR-LEAD-037</w:t>
+              <w:t>FR-LEAD-043</w:t>
             </w:r>
           </w:p>
         </w:tc>
@@ -3177,7 +3315,7 @@
           </w:tcPr>
           <w:p>
             <w:r>
-              <w:t>FR-LEAD-038</w:t>
+              <w:t>FR-LEAD-044</w:t>
             </w:r>
           </w:p>
         </w:tc>
@@ -3205,7 +3343,7 @@
           </w:tcPr>
           <w:p>
             <w:r>
-              <w:t>FR-LEAD-039</w:t>
+              <w:t>FR-LEAD-045</w:t>
             </w:r>
           </w:p>
         </w:tc>
@@ -3233,7 +3371,7 @@
           </w:tcPr>
           <w:p>
             <w:r>
-              <w:t>FR-LEAD-040</w:t>
+              <w:t>FR-LEAD-046</w:t>
             </w:r>
           </w:p>
         </w:tc>
@@ -3261,7 +3399,7 @@
           </w:tcPr>
           <w:p>
             <w:r>
-              <w:t>FR-LEAD-041</w:t>
+              <w:t>FR-LEAD-047</w:t>
             </w:r>
           </w:p>
         </w:tc>
@@ -3289,7 +3427,7 @@
           </w:tcPr>
           <w:p>
             <w:r>
-              <w:t>FR-LEAD-042</w:t>
+              <w:t>FR-LEAD-048</w:t>
             </w:r>
           </w:p>
         </w:tc>
@@ -3317,7 +3455,7 @@
           </w:tcPr>
           <w:p>
             <w:r>
-              <w:t>FR-LEAD-043</w:t>
+              <w:t>FR-LEAD-049</w:t>
             </w:r>
           </w:p>
         </w:tc>
@@ -3345,7 +3483,7 @@
           </w:tcPr>
           <w:p>
             <w:r>
-              <w:t>FR-LEAD-044</w:t>
+              <w:t>FR-LEAD-050</w:t>
             </w:r>
           </w:p>
         </w:tc>
@@ -3373,7 +3511,7 @@
           </w:tcPr>
           <w:p>
             <w:r>
-              <w:t>FR-LEAD-045</w:t>
+              <w:t>FR-LEAD-051</w:t>
             </w:r>
           </w:p>
         </w:tc>
@@ -3401,7 +3539,7 @@
           </w:tcPr>
           <w:p>
             <w:r>
-              <w:t>FR-LEAD-046</w:t>
+              <w:t>FR-LEAD-052</w:t>
             </w:r>
           </w:p>
         </w:tc>
@@ -3429,7 +3567,7 @@
           </w:tcPr>
           <w:p>
             <w:r>
-              <w:t>FR-LEAD-047</w:t>
+              <w:t>FR-LEAD-053</w:t>
             </w:r>
           </w:p>
         </w:tc>
@@ -3457,7 +3595,7 @@
           </w:tcPr>
           <w:p>
             <w:r>
-              <w:t>FR-LEAD-048</w:t>
+              <w:t>FR-LEAD-054</w:t>
             </w:r>
           </w:p>
         </w:tc>
@@ -3485,7 +3623,7 @@
           </w:tcPr>
           <w:p>
             <w:r>
-              <w:t>FR-LEAD-049</w:t>
+              <w:t>FR-LEAD-055</w:t>
             </w:r>
           </w:p>
         </w:tc>
@@ -3513,7 +3651,7 @@
           </w:tcPr>
           <w:p>
             <w:r>
-              <w:t>FR-LEAD-050</w:t>
+              <w:t>FR-LEAD-056</w:t>
             </w:r>
           </w:p>
         </w:tc>
@@ -3541,7 +3679,7 @@
           </w:tcPr>
           <w:p>
             <w:r>
-              <w:t>FR-LEAD-051</w:t>
+              <w:t>FR-LEAD-057</w:t>
             </w:r>
           </w:p>
         </w:tc>
@@ -3569,7 +3707,7 @@
           </w:tcPr>
           <w:p>
             <w:r>
-              <w:t>FR-LEAD-052</w:t>
+              <w:t>FR-LEAD-058</w:t>
             </w:r>
           </w:p>
         </w:tc>
@@ -3597,7 +3735,7 @@
           </w:tcPr>
           <w:p>
             <w:r>
-              <w:t>FR-LEAD-053</w:t>
+              <w:t>FR-LEAD-059</w:t>
             </w:r>
           </w:p>
         </w:tc>
@@ -3625,7 +3763,7 @@
           </w:tcPr>
           <w:p>
             <w:r>
-              <w:t>FR-LEAD-054</w:t>
+              <w:t>FR-LEAD-060</w:t>
             </w:r>
           </w:p>
         </w:tc>
@@ -3653,7 +3791,7 @@
           </w:tcPr>
           <w:p>
             <w:r>
-              <w:t>FR-LEAD-055</w:t>
+              <w:t>FR-LEAD-061</w:t>
             </w:r>
           </w:p>
         </w:tc>
@@ -3681,7 +3819,7 @@
           </w:tcPr>
           <w:p>
             <w:r>
-              <w:t>FR-LEAD-056</w:t>
+              <w:t>FR-LEAD-062</w:t>
             </w:r>
           </w:p>
         </w:tc>
@@ -3709,7 +3847,7 @@
           </w:tcPr>
           <w:p>
             <w:r>
-              <w:t>FR-LEAD-057</w:t>
+              <w:t>FR-LEAD-063</w:t>
             </w:r>
           </w:p>
         </w:tc>
@@ -3737,7 +3875,7 @@
           </w:tcPr>
           <w:p>
             <w:r>
-              <w:t>FR-LEAD-058</w:t>
+              <w:t>FR-LEAD-064</w:t>
             </w:r>
           </w:p>
         </w:tc>
@@ -3765,7 +3903,7 @@
           </w:tcPr>
           <w:p>
             <w:r>
-              <w:t>FR-LEAD-059</w:t>
+              <w:t>FR-LEAD-065</w:t>
             </w:r>
           </w:p>
         </w:tc>
@@ -3793,17 +3931,17 @@
           </w:tcPr>
           <w:p>
             <w:r>
-              <w:t>FR-LEAD-060</w:t>
-            </w:r>
-          </w:p>
-        </w:tc>
-        <w:tc>
-          <w:tcPr>
-            <w:tcW w:w="3312" w:type="dxa"/>
-          </w:tcPr>
-          <w:p>
-            <w:r>
-              <w:t>Leads</w:t>
+              <w:t>FR-OPP-001</w:t>
+            </w:r>
+          </w:p>
+        </w:tc>
+        <w:tc>
+          <w:tcPr>
+            <w:tcW w:w="3312" w:type="dxa"/>
+          </w:tcPr>
+          <w:p>
+            <w:r>
+              <w:t>Opportunities</w:t>
             </w:r>
           </w:p>
         </w:tc>
@@ -3821,17 +3959,17 @@
           </w:tcPr>
           <w:p>
             <w:r>
-              <w:t>FR-LEAD-061</w:t>
-            </w:r>
-          </w:p>
-        </w:tc>
-        <w:tc>
-          <w:tcPr>
-            <w:tcW w:w="3312" w:type="dxa"/>
-          </w:tcPr>
-          <w:p>
-            <w:r>
-              <w:t>Leads</w:t>
+              <w:t>FR-OPP-002</w:t>
+            </w:r>
+          </w:p>
+        </w:tc>
+        <w:tc>
+          <w:tcPr>
+            <w:tcW w:w="3312" w:type="dxa"/>
+          </w:tcPr>
+          <w:p>
+            <w:r>
+              <w:t>Opportunities</w:t>
             </w:r>
           </w:p>
         </w:tc>
@@ -3849,17 +3987,17 @@
           </w:tcPr>
           <w:p>
             <w:r>
-              <w:t>FR-LEAD-062</w:t>
-            </w:r>
-          </w:p>
-        </w:tc>
-        <w:tc>
-          <w:tcPr>
-            <w:tcW w:w="3312" w:type="dxa"/>
-          </w:tcPr>
-          <w:p>
-            <w:r>
-              <w:t>Leads</w:t>
+              <w:t>FR-OPP-003</w:t>
+            </w:r>
+          </w:p>
+        </w:tc>
+        <w:tc>
+          <w:tcPr>
+            <w:tcW w:w="3312" w:type="dxa"/>
+          </w:tcPr>
+          <w:p>
+            <w:r>
+              <w:t>Opportunities</w:t>
             </w:r>
           </w:p>
         </w:tc>
@@ -3877,17 +4015,17 @@
           </w:tcPr>
           <w:p>
             <w:r>
-              <w:t>FR-LEAD-063</w:t>
-            </w:r>
-          </w:p>
-        </w:tc>
-        <w:tc>
-          <w:tcPr>
-            <w:tcW w:w="3312" w:type="dxa"/>
-          </w:tcPr>
-          <w:p>
-            <w:r>
-              <w:t>Leads</w:t>
+              <w:t>FR-OPP-004</w:t>
+            </w:r>
+          </w:p>
+        </w:tc>
+        <w:tc>
+          <w:tcPr>
+            <w:tcW w:w="3312" w:type="dxa"/>
+          </w:tcPr>
+          <w:p>
+            <w:r>
+              <w:t>Opportunities</w:t>
             </w:r>
           </w:p>
         </w:tc>
@@ -3905,17 +4043,17 @@
           </w:tcPr>
           <w:p>
             <w:r>
-              <w:t>FR-LEAD-064</w:t>
-            </w:r>
-          </w:p>
-        </w:tc>
-        <w:tc>
-          <w:tcPr>
-            <w:tcW w:w="3312" w:type="dxa"/>
-          </w:tcPr>
-          <w:p>
-            <w:r>
-              <w:t>Leads</w:t>
+              <w:t>FR-OPP-005</w:t>
+            </w:r>
+          </w:p>
+        </w:tc>
+        <w:tc>
+          <w:tcPr>
+            <w:tcW w:w="3312" w:type="dxa"/>
+          </w:tcPr>
+          <w:p>
+            <w:r>
+              <w:t>Opportunities</w:t>
             </w:r>
           </w:p>
         </w:tc>
@@ -3933,17 +4071,17 @@
           </w:tcPr>
           <w:p>
             <w:r>
-              <w:t>FR-LEAD-065</w:t>
-            </w:r>
-          </w:p>
-        </w:tc>
-        <w:tc>
-          <w:tcPr>
-            <w:tcW w:w="3312" w:type="dxa"/>
-          </w:tcPr>
-          <w:p>
-            <w:r>
-              <w:t>Leads</w:t>
+              <w:t>FR-OPP-006</w:t>
+            </w:r>
+          </w:p>
+        </w:tc>
+        <w:tc>
+          <w:tcPr>
+            <w:tcW w:w="3312" w:type="dxa"/>
+          </w:tcPr>
+          <w:p>
+            <w:r>
+              <w:t>Opportunities</w:t>
             </w:r>
           </w:p>
         </w:tc>
@@ -3961,7 +4099,7 @@
           </w:tcPr>
           <w:p>
             <w:r>
-              <w:t>FR-OPP-001</w:t>
+              <w:t>FR-OPP-007</w:t>
             </w:r>
           </w:p>
         </w:tc>
@@ -3989,7 +4127,7 @@
           </w:tcPr>
           <w:p>
             <w:r>
-              <w:t>FR-OPP-002</w:t>
+              <w:t>FR-OPP-008</w:t>
             </w:r>
           </w:p>
         </w:tc>
@@ -4017,7 +4155,7 @@
           </w:tcPr>
           <w:p>
             <w:r>
-              <w:t>FR-OPP-003</w:t>
+              <w:t>FR-OPP-009</w:t>
             </w:r>
           </w:p>
         </w:tc>
@@ -4045,7 +4183,7 @@
           </w:tcPr>
           <w:p>
             <w:r>
-              <w:t>FR-OPP-004</w:t>
+              <w:t>FR-OPP-010</w:t>
             </w:r>
           </w:p>
         </w:tc>
@@ -4073,7 +4211,7 @@
           </w:tcPr>
           <w:p>
             <w:r>
-              <w:t>FR-OPP-005</w:t>
+              <w:t>FR-OPP-011</w:t>
             </w:r>
           </w:p>
         </w:tc>
@@ -4101,7 +4239,7 @@
           </w:tcPr>
           <w:p>
             <w:r>
-              <w:t>FR-OPP-006</w:t>
+              <w:t>FR-OPP-012</w:t>
             </w:r>
           </w:p>
         </w:tc>
@@ -4129,7 +4267,7 @@
           </w:tcPr>
           <w:p>
             <w:r>
-              <w:t>FR-OPP-007</w:t>
+              <w:t>FR-OPP-013</w:t>
             </w:r>
           </w:p>
         </w:tc>
@@ -4157,7 +4295,7 @@
           </w:tcPr>
           <w:p>
             <w:r>
-              <w:t>FR-OPP-008</w:t>
+              <w:t>FR-OPP-014</w:t>
             </w:r>
           </w:p>
         </w:tc>
@@ -4185,7 +4323,7 @@
           </w:tcPr>
           <w:p>
             <w:r>
-              <w:t>FR-OPP-009</w:t>
+              <w:t>FR-OPP-015</w:t>
             </w:r>
           </w:p>
         </w:tc>
@@ -4213,7 +4351,7 @@
           </w:tcPr>
           <w:p>
             <w:r>
-              <w:t>FR-OPP-010</w:t>
+              <w:t>FR-OPP-016</w:t>
             </w:r>
           </w:p>
         </w:tc>
@@ -4241,7 +4379,7 @@
           </w:tcPr>
           <w:p>
             <w:r>
-              <w:t>FR-OPP-011</w:t>
+              <w:t>FR-OPP-017</w:t>
             </w:r>
           </w:p>
         </w:tc>
@@ -4269,7 +4407,7 @@
           </w:tcPr>
           <w:p>
             <w:r>
-              <w:t>FR-OPP-012</w:t>
+              <w:t>FR-OPP-018</w:t>
             </w:r>
           </w:p>
         </w:tc>
@@ -4297,7 +4435,7 @@
           </w:tcPr>
           <w:p>
             <w:r>
-              <w:t>FR-OPP-013</w:t>
+              <w:t>FR-OPP-019</w:t>
             </w:r>
           </w:p>
         </w:tc>
@@ -4325,7 +4463,7 @@
           </w:tcPr>
           <w:p>
             <w:r>
-              <w:t>FR-OPP-014</w:t>
+              <w:t>FR-OPP-020</w:t>
             </w:r>
           </w:p>
         </w:tc>
@@ -4353,7 +4491,7 @@
           </w:tcPr>
           <w:p>
             <w:r>
-              <w:t>FR-OPP-015</w:t>
+              <w:t>FR-OPP-021</w:t>
             </w:r>
           </w:p>
         </w:tc>
@@ -4382,174 +4520,6 @@
           <w:p>
             <w:r>
               <w:lastRenderedPageBreak/>
-              <w:t>FR-OPP-016</w:t>
-            </w:r>
-          </w:p>
-        </w:tc>
-        <w:tc>
-          <w:tcPr>
-            <w:tcW w:w="3312" w:type="dxa"/>
-          </w:tcPr>
-          <w:p>
-            <w:r>
-              <w:t>Opportunities</w:t>
-            </w:r>
-          </w:p>
-        </w:tc>
-        <w:tc>
-          <w:tcPr>
-            <w:tcW w:w="3312" w:type="dxa"/>
-          </w:tcPr>
-          <w:p/>
-        </w:tc>
-      </w:tr>
-      <w:tr>
-        <w:tc>
-          <w:tcPr>
-            <w:tcW w:w="3312" w:type="dxa"/>
-          </w:tcPr>
-          <w:p>
-            <w:r>
-              <w:t>FR-OPP-017</w:t>
-            </w:r>
-          </w:p>
-        </w:tc>
-        <w:tc>
-          <w:tcPr>
-            <w:tcW w:w="3312" w:type="dxa"/>
-          </w:tcPr>
-          <w:p>
-            <w:r>
-              <w:t>Opportunities</w:t>
-            </w:r>
-          </w:p>
-        </w:tc>
-        <w:tc>
-          <w:tcPr>
-            <w:tcW w:w="3312" w:type="dxa"/>
-          </w:tcPr>
-          <w:p/>
-        </w:tc>
-      </w:tr>
-      <w:tr>
-        <w:tc>
-          <w:tcPr>
-            <w:tcW w:w="3312" w:type="dxa"/>
-          </w:tcPr>
-          <w:p>
-            <w:r>
-              <w:t>FR-OPP-018</w:t>
-            </w:r>
-          </w:p>
-        </w:tc>
-        <w:tc>
-          <w:tcPr>
-            <w:tcW w:w="3312" w:type="dxa"/>
-          </w:tcPr>
-          <w:p>
-            <w:r>
-              <w:t>Opportunities</w:t>
-            </w:r>
-          </w:p>
-        </w:tc>
-        <w:tc>
-          <w:tcPr>
-            <w:tcW w:w="3312" w:type="dxa"/>
-          </w:tcPr>
-          <w:p/>
-        </w:tc>
-      </w:tr>
-      <w:tr>
-        <w:tc>
-          <w:tcPr>
-            <w:tcW w:w="3312" w:type="dxa"/>
-          </w:tcPr>
-          <w:p>
-            <w:r>
-              <w:t>FR-OPP-019</w:t>
-            </w:r>
-          </w:p>
-        </w:tc>
-        <w:tc>
-          <w:tcPr>
-            <w:tcW w:w="3312" w:type="dxa"/>
-          </w:tcPr>
-          <w:p>
-            <w:r>
-              <w:t>Opportunities</w:t>
-            </w:r>
-          </w:p>
-        </w:tc>
-        <w:tc>
-          <w:tcPr>
-            <w:tcW w:w="3312" w:type="dxa"/>
-          </w:tcPr>
-          <w:p/>
-        </w:tc>
-      </w:tr>
-      <w:tr>
-        <w:tc>
-          <w:tcPr>
-            <w:tcW w:w="3312" w:type="dxa"/>
-          </w:tcPr>
-          <w:p>
-            <w:r>
-              <w:t>FR-OPP-020</w:t>
-            </w:r>
-          </w:p>
-        </w:tc>
-        <w:tc>
-          <w:tcPr>
-            <w:tcW w:w="3312" w:type="dxa"/>
-          </w:tcPr>
-          <w:p>
-            <w:r>
-              <w:t>Opportunities</w:t>
-            </w:r>
-          </w:p>
-        </w:tc>
-        <w:tc>
-          <w:tcPr>
-            <w:tcW w:w="3312" w:type="dxa"/>
-          </w:tcPr>
-          <w:p/>
-        </w:tc>
-      </w:tr>
-      <w:tr>
-        <w:tc>
-          <w:tcPr>
-            <w:tcW w:w="3312" w:type="dxa"/>
-          </w:tcPr>
-          <w:p>
-            <w:r>
-              <w:t>FR-OPP-021</w:t>
-            </w:r>
-          </w:p>
-        </w:tc>
-        <w:tc>
-          <w:tcPr>
-            <w:tcW w:w="3312" w:type="dxa"/>
-          </w:tcPr>
-          <w:p>
-            <w:r>
-              <w:t>Opportunities</w:t>
-            </w:r>
-          </w:p>
-        </w:tc>
-        <w:tc>
-          <w:tcPr>
-            <w:tcW w:w="3312" w:type="dxa"/>
-          </w:tcPr>
-          <w:p/>
-        </w:tc>
-      </w:tr>
-      <w:tr>
-        <w:tc>
-          <w:tcPr>
-            <w:tcW w:w="3312" w:type="dxa"/>
-          </w:tcPr>
-          <w:p>
-            <w:r>
               <w:t>FR-OPP-022</w:t>
             </w:r>
           </w:p>
@@ -5490,11 +5460,6 @@
         </w:tc>
       </w:tr>
     </w:tbl>
-    <w:p>
-      <w:pPr>
-        <w:pStyle w:val="Heading1"/>
-      </w:pPr>
-    </w:p>
     <w:p>
       <w:pPr>
         <w:pStyle w:val="Heading1"/>
@@ -5556,6 +5521,7 @@
         <w:pStyle w:val="Heading1"/>
       </w:pPr>
       <w:r>
+        <w:lastRenderedPageBreak/>
         <w:t>6. Assumptions and Constraints</w:t>
       </w:r>
     </w:p>
@@ -5862,7 +5828,7 @@
 </file>
 
 <file path=word/endnotes.xml><?xml version="1.0" encoding="utf-8"?>
-<w:endnotes xmlns:wpc="http://schemas.microsoft.com/office/word/2010/wordprocessingCanvas" xmlns:cx="http://schemas.microsoft.com/office/drawing/2014/chartex" xmlns:cx1="http://schemas.microsoft.com/office/drawing/2015/9/8/chartex" xmlns:cx2="http://schemas.microsoft.com/office/drawing/2015/10/21/chartex" xmlns:cx3="http://schemas.microsoft.com/office/drawing/2016/5/9/chartex" xmlns:cx4="http://schemas.microsoft.com/office/drawing/2016/5/10/chartex" xmlns:cx5="http://schemas.microsoft.com/office/drawing/2016/5/11/chartex" xmlns:cx6="http://schemas.microsoft.com/office/drawing/2016/5/12/chartex" xmlns:cx7="http://schemas.microsoft.com/office/drawing/2016/5/13/chartex" xmlns:cx8="http://schemas.microsoft.com/office/drawing/2016/5/14/chartex" xmlns:mc="http://schemas.openxmlformats.org/markup-compatibility/2006" xmlns:aink="http://schemas.microsoft.com/office/drawing/2016/ink" xmlns:am3d="http://schemas.microsoft.com/office/drawing/2017/model3d" xmlns:o="urn:schemas-microsoft-com:office:office" xmlns:oel="http://schemas.microsoft.com/office/2019/extlst" xmlns:r="http://schemas.openxmlformats.org/officeDocument/2006/relationships" xmlns:m="http://schemas.openxmlformats.org/officeDocument/2006/math" xmlns:v="urn:schemas-microsoft-com:vml" xmlns:wp14="http://schemas.microsoft.com/office/word/2010/wordprocessingDrawing" xmlns:wp="http://schemas.openxmlformats.org/drawingml/2006/wordprocessingDrawing" xmlns:w10="urn:schemas-microsoft-com:office:word" xmlns:w="http://schemas.openxmlformats.org/wordprocessingml/2006/main" xmlns:w14="http://schemas.microsoft.com/office/word/2010/wordml" xmlns:w15="http://schemas.microsoft.com/office/word/2012/wordml" xmlns:w16cei="http://schemas.microsoft.com/office/word/2026/wordml/cei" xmlns:w16cex="http://schemas.microsoft.com/office/word/2018/wordml/cex" xmlns:w16cid="http://schemas.microsoft.com/office/word/2016/wordml/cid" xmlns:w16="http://schemas.microsoft.com/office/word/2018/wordml" xmlns:w16du="http://schemas.microsoft.com/office/word/2023/wordml/word16du" xmlns:w16sdtdh="http://schemas.microsoft.com/office/word/2020/wordml/sdtdatahash" xmlns:w16sdtfl="http://schemas.microsoft.com/office/word/2024/wordml/sdtformatlock" xmlns:w16se="http://schemas.microsoft.com/office/word/2015/wordml/symex" xmlns:wpg="http://schemas.microsoft.com/office/word/2010/wordprocessingGroup" xmlns:wpi="http://schemas.microsoft.com/office/word/2010/wordprocessingInk" xmlns:wne="http://schemas.microsoft.com/office/word/2006/wordml" xmlns:wps="http://schemas.microsoft.com/office/word/2010/wordprocessingShape" mc:Ignorable="w14 w15 w16se w16cid w16 w16cex w16sdtdh w16sdtfl w16du wp14">
+<w:endnotes xmlns:wpc="http://schemas.microsoft.com/office/word/2010/wordprocessingCanvas" xmlns:cx="http://schemas.microsoft.com/office/drawing/2014/chartex" xmlns:cx1="http://schemas.microsoft.com/office/drawing/2015/9/8/chartex" xmlns:cx2="http://schemas.microsoft.com/office/drawing/2015/10/21/chartex" xmlns:cx3="http://schemas.microsoft.com/office/drawing/2016/5/9/chartex" xmlns:cx4="http://schemas.microsoft.com/office/drawing/2016/5/10/chartex" xmlns:cx5="http://schemas.microsoft.com/office/drawing/2016/5/11/chartex" xmlns:cx6="http://schemas.microsoft.com/office/drawing/2016/5/12/chartex" xmlns:cx7="http://schemas.microsoft.com/office/drawing/2016/5/13/chartex" xmlns:cx8="http://schemas.microsoft.com/office/drawing/2016/5/14/chartex" xmlns:mc="http://schemas.openxmlformats.org/markup-compatibility/2006" xmlns:aink="http://schemas.microsoft.com/office/drawing/2016/ink" xmlns:am3d="http://schemas.microsoft.com/office/drawing/2017/model3d" xmlns:o="urn:schemas-microsoft-com:office:office" xmlns:oel="http://schemas.microsoft.com/office/2019/extlst" xmlns:r="http://schemas.openxmlformats.org/officeDocument/2006/relationships" xmlns:m="http://schemas.openxmlformats.org/officeDocument/2006/math" xmlns:v="urn:schemas-microsoft-com:vml" xmlns:wp14="http://schemas.microsoft.com/office/word/2010/wordprocessingDrawing" xmlns:wp="http://schemas.openxmlformats.org/drawingml/2006/wordprocessingDrawing" xmlns:w10="urn:schemas-microsoft-com:office:word" xmlns:w="http://schemas.openxmlformats.org/wordprocessingml/2006/main" xmlns:w14="http://schemas.microsoft.com/office/word/2010/wordml" xmlns:w15="http://schemas.microsoft.com/office/word/2012/wordml" xmlns:w16cex="http://schemas.microsoft.com/office/word/2018/wordml/cex" xmlns:w16cid="http://schemas.microsoft.com/office/word/2016/wordml/cid" xmlns:w16="http://schemas.microsoft.com/office/word/2018/wordml" xmlns:w16du="http://schemas.microsoft.com/office/word/2023/wordml/word16du" xmlns:w16sdtdh="http://schemas.microsoft.com/office/word/2020/wordml/sdtdatahash" xmlns:w16sdtfl="http://schemas.microsoft.com/office/word/2024/wordml/sdtformatlock" xmlns:w16se="http://schemas.microsoft.com/office/word/2015/wordml/symex" xmlns:wpg="http://schemas.microsoft.com/office/word/2010/wordprocessingGroup" xmlns:wpi="http://schemas.microsoft.com/office/word/2010/wordprocessingInk" xmlns:wne="http://schemas.microsoft.com/office/word/2006/wordml" xmlns:wps="http://schemas.microsoft.com/office/word/2010/wordprocessingShape" mc:Ignorable="w14 w15 w16se w16cid w16 w16cex w16sdtdh w16sdtfl w16du wp14">
   <w:endnote w:type="separator" w:id="-1">
     <w:p>
       <w:pPr>
@@ -5887,7 +5853,7 @@
 </file>
 
 <file path=word/footer1.xml><?xml version="1.0" encoding="utf-8"?>
-<w:ftr xmlns:wpc="http://schemas.microsoft.com/office/word/2010/wordprocessingCanvas" xmlns:cx="http://schemas.microsoft.com/office/drawing/2014/chartex" xmlns:cx1="http://schemas.microsoft.com/office/drawing/2015/9/8/chartex" xmlns:cx2="http://schemas.microsoft.com/office/drawing/2015/10/21/chartex" xmlns:cx3="http://schemas.microsoft.com/office/drawing/2016/5/9/chartex" xmlns:cx4="http://schemas.microsoft.com/office/drawing/2016/5/10/chartex" xmlns:cx5="http://schemas.microsoft.com/office/drawing/2016/5/11/chartex" xmlns:cx6="http://schemas.microsoft.com/office/drawing/2016/5/12/chartex" xmlns:cx7="http://schemas.microsoft.com/office/drawing/2016/5/13/chartex" xmlns:cx8="http://schemas.microsoft.com/office/drawing/2016/5/14/chartex" xmlns:mc="http://schemas.openxmlformats.org/markup-compatibility/2006" xmlns:aink="http://schemas.microsoft.com/office/drawing/2016/ink" xmlns:am3d="http://schemas.microsoft.com/office/drawing/2017/model3d" xmlns:o="urn:schemas-microsoft-com:office:office" xmlns:oel="http://schemas.microsoft.com/office/2019/extlst" xmlns:r="http://schemas.openxmlformats.org/officeDocument/2006/relationships" xmlns:m="http://schemas.openxmlformats.org/officeDocument/2006/math" xmlns:v="urn:schemas-microsoft-com:vml" xmlns:wp14="http://schemas.microsoft.com/office/word/2010/wordprocessingDrawing" xmlns:wp="http://schemas.openxmlformats.org/drawingml/2006/wordprocessingDrawing" xmlns:w10="urn:schemas-microsoft-com:office:word" xmlns:w="http://schemas.openxmlformats.org/wordprocessingml/2006/main" xmlns:w14="http://schemas.microsoft.com/office/word/2010/wordml" xmlns:w15="http://schemas.microsoft.com/office/word/2012/wordml" xmlns:w16cei="http://schemas.microsoft.com/office/word/2026/wordml/cei" xmlns:w16cex="http://schemas.microsoft.com/office/word/2018/wordml/cex" xmlns:w16cid="http://schemas.microsoft.com/office/word/2016/wordml/cid" xmlns:w16="http://schemas.microsoft.com/office/word/2018/wordml" xmlns:w16du="http://schemas.microsoft.com/office/word/2023/wordml/word16du" xmlns:w16sdtdh="http://schemas.microsoft.com/office/word/2020/wordml/sdtdatahash" xmlns:w16sdtfl="http://schemas.microsoft.com/office/word/2024/wordml/sdtformatlock" xmlns:w16se="http://schemas.microsoft.com/office/word/2015/wordml/symex" xmlns:wpg="http://schemas.microsoft.com/office/word/2010/wordprocessingGroup" xmlns:wpi="http://schemas.microsoft.com/office/word/2010/wordprocessingInk" xmlns:wne="http://schemas.microsoft.com/office/word/2006/wordml" xmlns:wps="http://schemas.microsoft.com/office/word/2010/wordprocessingShape" mc:Ignorable="w14 w15 w16se w16cid w16 w16cex w16sdtdh w16sdtfl w16du wp14">
+<w:ftr xmlns:wpc="http://schemas.microsoft.com/office/word/2010/wordprocessingCanvas" xmlns:cx="http://schemas.microsoft.com/office/drawing/2014/chartex" xmlns:cx1="http://schemas.microsoft.com/office/drawing/2015/9/8/chartex" xmlns:cx2="http://schemas.microsoft.com/office/drawing/2015/10/21/chartex" xmlns:cx3="http://schemas.microsoft.com/office/drawing/2016/5/9/chartex" xmlns:cx4="http://schemas.microsoft.com/office/drawing/2016/5/10/chartex" xmlns:cx5="http://schemas.microsoft.com/office/drawing/2016/5/11/chartex" xmlns:cx6="http://schemas.microsoft.com/office/drawing/2016/5/12/chartex" xmlns:cx7="http://schemas.microsoft.com/office/drawing/2016/5/13/chartex" xmlns:cx8="http://schemas.microsoft.com/office/drawing/2016/5/14/chartex" xmlns:mc="http://schemas.openxmlformats.org/markup-compatibility/2006" xmlns:aink="http://schemas.microsoft.com/office/drawing/2016/ink" xmlns:am3d="http://schemas.microsoft.com/office/drawing/2017/model3d" xmlns:o="urn:schemas-microsoft-com:office:office" xmlns:oel="http://schemas.microsoft.com/office/2019/extlst" xmlns:r="http://schemas.openxmlformats.org/officeDocument/2006/relationships" xmlns:m="http://schemas.openxmlformats.org/officeDocument/2006/math" xmlns:v="urn:schemas-microsoft-com:vml" xmlns:wp14="http://schemas.microsoft.com/office/word/2010/wordprocessingDrawing" xmlns:wp="http://schemas.openxmlformats.org/drawingml/2006/wordprocessingDrawing" xmlns:w10="urn:schemas-microsoft-com:office:word" xmlns:w="http://schemas.openxmlformats.org/wordprocessingml/2006/main" xmlns:w14="http://schemas.microsoft.com/office/word/2010/wordml" xmlns:w15="http://schemas.microsoft.com/office/word/2012/wordml" xmlns:w16cex="http://schemas.microsoft.com/office/word/2018/wordml/cex" xmlns:w16cid="http://schemas.microsoft.com/office/word/2016/wordml/cid" xmlns:w16="http://schemas.microsoft.com/office/word/2018/wordml" xmlns:w16du="http://schemas.microsoft.com/office/word/2023/wordml/word16du" xmlns:w16sdtdh="http://schemas.microsoft.com/office/word/2020/wordml/sdtdatahash" xmlns:w16sdtfl="http://schemas.microsoft.com/office/word/2024/wordml/sdtformatlock" xmlns:w16se="http://schemas.microsoft.com/office/word/2015/wordml/symex" xmlns:wpg="http://schemas.microsoft.com/office/word/2010/wordprocessingGroup" xmlns:wpi="http://schemas.microsoft.com/office/word/2010/wordprocessingInk" xmlns:wne="http://schemas.microsoft.com/office/word/2006/wordml" xmlns:wps="http://schemas.microsoft.com/office/word/2010/wordprocessingShape" mc:Ignorable="w14 w15 w16se w16cid w16 w16cex w16sdtdh w16sdtfl w16du wp14">
   <w:p>
     <w:pPr>
       <w:pStyle w:val="Footer"/>
@@ -5919,7 +5885,7 @@
 </file>
 
 <file path=word/footnotes.xml><?xml version="1.0" encoding="utf-8"?>
-<w:footnotes xmlns:wpc="http://schemas.microsoft.com/office/word/2010/wordprocessingCanvas" xmlns:cx="http://schemas.microsoft.com/office/drawing/2014/chartex" xmlns:cx1="http://schemas.microsoft.com/office/drawing/2015/9/8/chartex" xmlns:cx2="http://schemas.microsoft.com/office/drawing/2015/10/21/chartex" xmlns:cx3="http://schemas.microsoft.com/office/drawing/2016/5/9/chartex" xmlns:cx4="http://schemas.microsoft.com/office/drawing/2016/5/10/chartex" xmlns:cx5="http://schemas.microsoft.com/office/drawing/2016/5/11/chartex" xmlns:cx6="http://schemas.microsoft.com/office/drawing/2016/5/12/chartex" xmlns:cx7="http://schemas.microsoft.com/office/drawing/2016/5/13/chartex" xmlns:cx8="http://schemas.microsoft.com/office/drawing/2016/5/14/chartex" xmlns:mc="http://schemas.openxmlformats.org/markup-compatibility/2006" xmlns:aink="http://schemas.microsoft.com/office/drawing/2016/ink" xmlns:am3d="http://schemas.microsoft.com/office/drawing/2017/model3d" xmlns:o="urn:schemas-microsoft-com:office:office" xmlns:oel="http://schemas.microsoft.com/office/2019/extlst" xmlns:r="http://schemas.openxmlformats.org/officeDocument/2006/relationships" xmlns:m="http://schemas.openxmlformats.org/officeDocument/2006/math" xmlns:v="urn:schemas-microsoft-com:vml" xmlns:wp14="http://schemas.microsoft.com/office/word/2010/wordprocessingDrawing" xmlns:wp="http://schemas.openxmlformats.org/drawingml/2006/wordprocessingDrawing" xmlns:w10="urn:schemas-microsoft-com:office:word" xmlns:w="http://schemas.openxmlformats.org/wordprocessingml/2006/main" xmlns:w14="http://schemas.microsoft.com/office/word/2010/wordml" xmlns:w15="http://schemas.microsoft.com/office/word/2012/wordml" xmlns:w16cei="http://schemas.microsoft.com/office/word/2026/wordml/cei" xmlns:w16cex="http://schemas.microsoft.com/office/word/2018/wordml/cex" xmlns:w16cid="http://schemas.microsoft.com/office/word/2016/wordml/cid" xmlns:w16="http://schemas.microsoft.com/office/word/2018/wordml" xmlns:w16du="http://schemas.microsoft.com/office/word/2023/wordml/word16du" xmlns:w16sdtdh="http://schemas.microsoft.com/office/word/2020/wordml/sdtdatahash" xmlns:w16sdtfl="http://schemas.microsoft.com/office/word/2024/wordml/sdtformatlock" xmlns:w16se="http://schemas.microsoft.com/office/word/2015/wordml/symex" xmlns:wpg="http://schemas.microsoft.com/office/word/2010/wordprocessingGroup" xmlns:wpi="http://schemas.microsoft.com/office/word/2010/wordprocessingInk" xmlns:wne="http://schemas.microsoft.com/office/word/2006/wordml" xmlns:wps="http://schemas.microsoft.com/office/word/2010/wordprocessingShape" mc:Ignorable="w14 w15 w16se w16cid w16 w16cex w16sdtdh w16sdtfl w16du wp14">
+<w:footnotes xmlns:wpc="http://schemas.microsoft.com/office/word/2010/wordprocessingCanvas" xmlns:cx="http://schemas.microsoft.com/office/drawing/2014/chartex" xmlns:cx1="http://schemas.microsoft.com/office/drawing/2015/9/8/chartex" xmlns:cx2="http://schemas.microsoft.com/office/drawing/2015/10/21/chartex" xmlns:cx3="http://schemas.microsoft.com/office/drawing/2016/5/9/chartex" xmlns:cx4="http://schemas.microsoft.com/office/drawing/2016/5/10/chartex" xmlns:cx5="http://schemas.microsoft.com/office/drawing/2016/5/11/chartex" xmlns:cx6="http://schemas.microsoft.com/office/drawing/2016/5/12/chartex" xmlns:cx7="http://schemas.microsoft.com/office/drawing/2016/5/13/chartex" xmlns:cx8="http://schemas.microsoft.com/office/drawing/2016/5/14/chartex" xmlns:mc="http://schemas.openxmlformats.org/markup-compatibility/2006" xmlns:aink="http://schemas.microsoft.com/office/drawing/2016/ink" xmlns:am3d="http://schemas.microsoft.com/office/drawing/2017/model3d" xmlns:o="urn:schemas-microsoft-com:office:office" xmlns:oel="http://schemas.microsoft.com/office/2019/extlst" xmlns:r="http://schemas.openxmlformats.org/officeDocument/2006/relationships" xmlns:m="http://schemas.openxmlformats.org/officeDocument/2006/math" xmlns:v="urn:schemas-microsoft-com:vml" xmlns:wp14="http://schemas.microsoft.com/office/word/2010/wordprocessingDrawing" xmlns:wp="http://schemas.openxmlformats.org/drawingml/2006/wordprocessingDrawing" xmlns:w10="urn:schemas-microsoft-com:office:word" xmlns:w="http://schemas.openxmlformats.org/wordprocessingml/2006/main" xmlns:w14="http://schemas.microsoft.com/office/word/2010/wordml" xmlns:w15="http://schemas.microsoft.com/office/word/2012/wordml" xmlns:w16cex="http://schemas.microsoft.com/office/word/2018/wordml/cex" xmlns:w16cid="http://schemas.microsoft.com/office/word/2016/wordml/cid" xmlns:w16="http://schemas.microsoft.com/office/word/2018/wordml" xmlns:w16du="http://schemas.microsoft.com/office/word/2023/wordml/word16du" xmlns:w16sdtdh="http://schemas.microsoft.com/office/word/2020/wordml/sdtdatahash" xmlns:w16sdtfl="http://schemas.microsoft.com/office/word/2024/wordml/sdtformatlock" xmlns:w16se="http://schemas.microsoft.com/office/word/2015/wordml/symex" xmlns:wpg="http://schemas.microsoft.com/office/word/2010/wordprocessingGroup" xmlns:wpi="http://schemas.microsoft.com/office/word/2010/wordprocessingInk" xmlns:wne="http://schemas.microsoft.com/office/word/2006/wordml" xmlns:wps="http://schemas.microsoft.com/office/word/2010/wordprocessingShape" mc:Ignorable="w14 w15 w16se w16cid w16 w16cex w16sdtdh w16sdtfl w16du wp14">
   <w:footnote w:type="separator" w:id="-1">
     <w:p>
       <w:pPr>
@@ -5944,7 +5910,7 @@
 </file>
 
 <file path=word/numbering.xml><?xml version="1.0" encoding="utf-8"?>
-<w:numbering xmlns:wpc="http://schemas.microsoft.com/office/word/2010/wordprocessingCanvas" xmlns:cx="http://schemas.microsoft.com/office/drawing/2014/chartex" xmlns:cx1="http://schemas.microsoft.com/office/drawing/2015/9/8/chartex" xmlns:cx2="http://schemas.microsoft.com/office/drawing/2015/10/21/chartex" xmlns:cx3="http://schemas.microsoft.com/office/drawing/2016/5/9/chartex" xmlns:cx4="http://schemas.microsoft.com/office/drawing/2016/5/10/chartex" xmlns:cx5="http://schemas.microsoft.com/office/drawing/2016/5/11/chartex" xmlns:cx6="http://schemas.microsoft.com/office/drawing/2016/5/12/chartex" xmlns:cx7="http://schemas.microsoft.com/office/drawing/2016/5/13/chartex" xmlns:cx8="http://schemas.microsoft.com/office/drawing/2016/5/14/chartex" xmlns:mc="http://schemas.openxmlformats.org/markup-compatibility/2006" xmlns:aink="http://schemas.microsoft.com/office/drawing/2016/ink" xmlns:am3d="http://schemas.microsoft.com/office/drawing/2017/model3d" xmlns:o="urn:schemas-microsoft-com:office:office" xmlns:oel="http://schemas.microsoft.com/office/2019/extlst" xmlns:r="http://schemas.openxmlformats.org/officeDocument/2006/relationships" xmlns:m="http://schemas.openxmlformats.org/officeDocument/2006/math" xmlns:v="urn:schemas-microsoft-com:vml" xmlns:wp14="http://schemas.microsoft.com/office/word/2010/wordprocessingDrawing" xmlns:wp="http://schemas.openxmlformats.org/drawingml/2006/wordprocessingDrawing" xmlns:w10="urn:schemas-microsoft-com:office:word" xmlns:w="http://schemas.openxmlformats.org/wordprocessingml/2006/main" xmlns:w14="http://schemas.microsoft.com/office/word/2010/wordml" xmlns:w15="http://schemas.microsoft.com/office/word/2012/wordml" xmlns:w16cei="http://schemas.microsoft.com/office/word/2026/wordml/cei" xmlns:w16cex="http://schemas.microsoft.com/office/word/2018/wordml/cex" xmlns:w16cid="http://schemas.microsoft.com/office/word/2016/wordml/cid" xmlns:w16="http://schemas.microsoft.com/office/word/2018/wordml" xmlns:w16du="http://schemas.microsoft.com/office/word/2023/wordml/word16du" xmlns:w16sdtdh="http://schemas.microsoft.com/office/word/2020/wordml/sdtdatahash" xmlns:w16sdtfl="http://schemas.microsoft.com/office/word/2024/wordml/sdtformatlock" xmlns:w16se="http://schemas.microsoft.com/office/word/2015/wordml/symex" xmlns:wpg="http://schemas.microsoft.com/office/word/2010/wordprocessingGroup" xmlns:wpi="http://schemas.microsoft.com/office/word/2010/wordprocessingInk" xmlns:wne="http://schemas.microsoft.com/office/word/2006/wordml" xmlns:wps="http://schemas.microsoft.com/office/word/2010/wordprocessingShape" mc:Ignorable="w14 w15 w16se w16cid w16 w16cex w16sdtdh w16sdtfl w16du wp14">
+<w:numbering xmlns:wpc="http://schemas.microsoft.com/office/word/2010/wordprocessingCanvas" xmlns:cx="http://schemas.microsoft.com/office/drawing/2014/chartex" xmlns:cx1="http://schemas.microsoft.com/office/drawing/2015/9/8/chartex" xmlns:cx2="http://schemas.microsoft.com/office/drawing/2015/10/21/chartex" xmlns:cx3="http://schemas.microsoft.com/office/drawing/2016/5/9/chartex" xmlns:cx4="http://schemas.microsoft.com/office/drawing/2016/5/10/chartex" xmlns:cx5="http://schemas.microsoft.com/office/drawing/2016/5/11/chartex" xmlns:cx6="http://schemas.microsoft.com/office/drawing/2016/5/12/chartex" xmlns:cx7="http://schemas.microsoft.com/office/drawing/2016/5/13/chartex" xmlns:cx8="http://schemas.microsoft.com/office/drawing/2016/5/14/chartex" xmlns:mc="http://schemas.openxmlformats.org/markup-compatibility/2006" xmlns:aink="http://schemas.microsoft.com/office/drawing/2016/ink" xmlns:am3d="http://schemas.microsoft.com/office/drawing/2017/model3d" xmlns:o="urn:schemas-microsoft-com:office:office" xmlns:oel="http://schemas.microsoft.com/office/2019/extlst" xmlns:r="http://schemas.openxmlformats.org/officeDocument/2006/relationships" xmlns:m="http://schemas.openxmlformats.org/officeDocument/2006/math" xmlns:v="urn:schemas-microsoft-com:vml" xmlns:wp14="http://schemas.microsoft.com/office/word/2010/wordprocessingDrawing" xmlns:wp="http://schemas.openxmlformats.org/drawingml/2006/wordprocessingDrawing" xmlns:w10="urn:schemas-microsoft-com:office:word" xmlns:w="http://schemas.openxmlformats.org/wordprocessingml/2006/main" xmlns:w14="http://schemas.microsoft.com/office/word/2010/wordml" xmlns:w15="http://schemas.microsoft.com/office/word/2012/wordml" xmlns:w16cex="http://schemas.microsoft.com/office/word/2018/wordml/cex" xmlns:w16cid="http://schemas.microsoft.com/office/word/2016/wordml/cid" xmlns:w16="http://schemas.microsoft.com/office/word/2018/wordml" xmlns:w16du="http://schemas.microsoft.com/office/word/2023/wordml/word16du" xmlns:w16sdtdh="http://schemas.microsoft.com/office/word/2020/wordml/sdtdatahash" xmlns:w16sdtfl="http://schemas.microsoft.com/office/word/2024/wordml/sdtformatlock" xmlns:w16se="http://schemas.microsoft.com/office/word/2015/wordml/symex" xmlns:wpg="http://schemas.microsoft.com/office/word/2010/wordprocessingGroup" xmlns:wpi="http://schemas.microsoft.com/office/word/2010/wordprocessingInk" xmlns:wne="http://schemas.microsoft.com/office/word/2006/wordml" xmlns:wps="http://schemas.microsoft.com/office/word/2010/wordprocessingShape" mc:Ignorable="w14 w15 w16se w16cid w16 w16cex w16sdtdh w16sdtfl w16du wp14">
   <w:abstractNum w:abstractNumId="0" w15:restartNumberingAfterBreak="0">
     <w:nsid w:val="FFFFFF7C"/>
     <w:multiLevelType w:val="singleLevel"/>
@@ -6098,7 +6064,7 @@
   <w:abstractNum w:abstractNumId="8" w15:restartNumberingAfterBreak="0">
     <w:nsid w:val="FFFFFF89"/>
     <w:multiLevelType w:val="singleLevel"/>
-    <w:tmpl w:val="29761A62"/>
+    <w:tmpl w:val="5C0C8F50"/>
     <w:lvl w:ilvl="0">
       <w:start w:val="1"/>
       <w:numFmt w:val="bullet"/>
@@ -6113,6 +6079,232 @@
       </w:pPr>
       <w:rPr>
         <w:rFonts w:ascii="Symbol" w:hAnsi="Symbol" w:hint="default"/>
+      </w:rPr>
+    </w:lvl>
+  </w:abstractNum>
+  <w:abstractNum w:abstractNumId="9" w15:restartNumberingAfterBreak="0">
+    <w:nsid w:val="450F0882"/>
+    <w:multiLevelType w:val="hybridMultilevel"/>
+    <w:tmpl w:val="44108A72"/>
+    <w:lvl w:ilvl="0" w:tplc="40090001">
+      <w:start w:val="1"/>
+      <w:numFmt w:val="bullet"/>
+      <w:lvlText w:val=""/>
+      <w:lvlJc w:val="left"/>
+      <w:pPr>
+        <w:ind w:left="720" w:hanging="360"/>
+      </w:pPr>
+      <w:rPr>
+        <w:rFonts w:ascii="Symbol" w:hAnsi="Symbol" w:hint="default"/>
+      </w:rPr>
+    </w:lvl>
+    <w:lvl w:ilvl="1" w:tplc="40090003" w:tentative="1">
+      <w:start w:val="1"/>
+      <w:numFmt w:val="bullet"/>
+      <w:lvlText w:val="o"/>
+      <w:lvlJc w:val="left"/>
+      <w:pPr>
+        <w:ind w:left="1440" w:hanging="360"/>
+      </w:pPr>
+      <w:rPr>
+        <w:rFonts w:ascii="Courier New" w:hAnsi="Courier New" w:cs="Courier New" w:hint="default"/>
+      </w:rPr>
+    </w:lvl>
+    <w:lvl w:ilvl="2" w:tplc="40090005" w:tentative="1">
+      <w:start w:val="1"/>
+      <w:numFmt w:val="bullet"/>
+      <w:lvlText w:val=""/>
+      <w:lvlJc w:val="left"/>
+      <w:pPr>
+        <w:ind w:left="2160" w:hanging="360"/>
+      </w:pPr>
+      <w:rPr>
+        <w:rFonts w:ascii="Wingdings" w:hAnsi="Wingdings" w:hint="default"/>
+      </w:rPr>
+    </w:lvl>
+    <w:lvl w:ilvl="3" w:tplc="40090001" w:tentative="1">
+      <w:start w:val="1"/>
+      <w:numFmt w:val="bullet"/>
+      <w:lvlText w:val=""/>
+      <w:lvlJc w:val="left"/>
+      <w:pPr>
+        <w:ind w:left="2880" w:hanging="360"/>
+      </w:pPr>
+      <w:rPr>
+        <w:rFonts w:ascii="Symbol" w:hAnsi="Symbol" w:hint="default"/>
+      </w:rPr>
+    </w:lvl>
+    <w:lvl w:ilvl="4" w:tplc="40090003" w:tentative="1">
+      <w:start w:val="1"/>
+      <w:numFmt w:val="bullet"/>
+      <w:lvlText w:val="o"/>
+      <w:lvlJc w:val="left"/>
+      <w:pPr>
+        <w:ind w:left="3600" w:hanging="360"/>
+      </w:pPr>
+      <w:rPr>
+        <w:rFonts w:ascii="Courier New" w:hAnsi="Courier New" w:cs="Courier New" w:hint="default"/>
+      </w:rPr>
+    </w:lvl>
+    <w:lvl w:ilvl="5" w:tplc="40090005" w:tentative="1">
+      <w:start w:val="1"/>
+      <w:numFmt w:val="bullet"/>
+      <w:lvlText w:val=""/>
+      <w:lvlJc w:val="left"/>
+      <w:pPr>
+        <w:ind w:left="4320" w:hanging="360"/>
+      </w:pPr>
+      <w:rPr>
+        <w:rFonts w:ascii="Wingdings" w:hAnsi="Wingdings" w:hint="default"/>
+      </w:rPr>
+    </w:lvl>
+    <w:lvl w:ilvl="6" w:tplc="40090001" w:tentative="1">
+      <w:start w:val="1"/>
+      <w:numFmt w:val="bullet"/>
+      <w:lvlText w:val=""/>
+      <w:lvlJc w:val="left"/>
+      <w:pPr>
+        <w:ind w:left="5040" w:hanging="360"/>
+      </w:pPr>
+      <w:rPr>
+        <w:rFonts w:ascii="Symbol" w:hAnsi="Symbol" w:hint="default"/>
+      </w:rPr>
+    </w:lvl>
+    <w:lvl w:ilvl="7" w:tplc="40090003" w:tentative="1">
+      <w:start w:val="1"/>
+      <w:numFmt w:val="bullet"/>
+      <w:lvlText w:val="o"/>
+      <w:lvlJc w:val="left"/>
+      <w:pPr>
+        <w:ind w:left="5760" w:hanging="360"/>
+      </w:pPr>
+      <w:rPr>
+        <w:rFonts w:ascii="Courier New" w:hAnsi="Courier New" w:cs="Courier New" w:hint="default"/>
+      </w:rPr>
+    </w:lvl>
+    <w:lvl w:ilvl="8" w:tplc="40090005" w:tentative="1">
+      <w:start w:val="1"/>
+      <w:numFmt w:val="bullet"/>
+      <w:lvlText w:val=""/>
+      <w:lvlJc w:val="left"/>
+      <w:pPr>
+        <w:ind w:left="6480" w:hanging="360"/>
+      </w:pPr>
+      <w:rPr>
+        <w:rFonts w:ascii="Wingdings" w:hAnsi="Wingdings" w:hint="default"/>
+      </w:rPr>
+    </w:lvl>
+  </w:abstractNum>
+  <w:abstractNum w:abstractNumId="10" w15:restartNumberingAfterBreak="0">
+    <w:nsid w:val="491C00F1"/>
+    <w:multiLevelType w:val="hybridMultilevel"/>
+    <w:tmpl w:val="86AC1BCE"/>
+    <w:lvl w:ilvl="0" w:tplc="40090001">
+      <w:start w:val="1"/>
+      <w:numFmt w:val="bullet"/>
+      <w:lvlText w:val=""/>
+      <w:lvlJc w:val="left"/>
+      <w:pPr>
+        <w:ind w:left="360" w:hanging="360"/>
+      </w:pPr>
+      <w:rPr>
+        <w:rFonts w:ascii="Symbol" w:hAnsi="Symbol" w:hint="default"/>
+      </w:rPr>
+    </w:lvl>
+    <w:lvl w:ilvl="1" w:tplc="40090003" w:tentative="1">
+      <w:start w:val="1"/>
+      <w:numFmt w:val="bullet"/>
+      <w:lvlText w:val="o"/>
+      <w:lvlJc w:val="left"/>
+      <w:pPr>
+        <w:ind w:left="1080" w:hanging="360"/>
+      </w:pPr>
+      <w:rPr>
+        <w:rFonts w:ascii="Courier New" w:hAnsi="Courier New" w:cs="Courier New" w:hint="default"/>
+      </w:rPr>
+    </w:lvl>
+    <w:lvl w:ilvl="2" w:tplc="40090005" w:tentative="1">
+      <w:start w:val="1"/>
+      <w:numFmt w:val="bullet"/>
+      <w:lvlText w:val=""/>
+      <w:lvlJc w:val="left"/>
+      <w:pPr>
+        <w:ind w:left="1800" w:hanging="360"/>
+      </w:pPr>
+      <w:rPr>
+        <w:rFonts w:ascii="Wingdings" w:hAnsi="Wingdings" w:hint="default"/>
+      </w:rPr>
+    </w:lvl>
+    <w:lvl w:ilvl="3" w:tplc="40090001" w:tentative="1">
+      <w:start w:val="1"/>
+      <w:numFmt w:val="bullet"/>
+      <w:lvlText w:val=""/>
+      <w:lvlJc w:val="left"/>
+      <w:pPr>
+        <w:ind w:left="2520" w:hanging="360"/>
+      </w:pPr>
+      <w:rPr>
+        <w:rFonts w:ascii="Symbol" w:hAnsi="Symbol" w:hint="default"/>
+      </w:rPr>
+    </w:lvl>
+    <w:lvl w:ilvl="4" w:tplc="40090003" w:tentative="1">
+      <w:start w:val="1"/>
+      <w:numFmt w:val="bullet"/>
+      <w:lvlText w:val="o"/>
+      <w:lvlJc w:val="left"/>
+      <w:pPr>
+        <w:ind w:left="3240" w:hanging="360"/>
+      </w:pPr>
+      <w:rPr>
+        <w:rFonts w:ascii="Courier New" w:hAnsi="Courier New" w:cs="Courier New" w:hint="default"/>
+      </w:rPr>
+    </w:lvl>
+    <w:lvl w:ilvl="5" w:tplc="40090005" w:tentative="1">
+      <w:start w:val="1"/>
+      <w:numFmt w:val="bullet"/>
+      <w:lvlText w:val=""/>
+      <w:lvlJc w:val="left"/>
+      <w:pPr>
+        <w:ind w:left="3960" w:hanging="360"/>
+      </w:pPr>
+      <w:rPr>
+        <w:rFonts w:ascii="Wingdings" w:hAnsi="Wingdings" w:hint="default"/>
+      </w:rPr>
+    </w:lvl>
+    <w:lvl w:ilvl="6" w:tplc="40090001" w:tentative="1">
+      <w:start w:val="1"/>
+      <w:numFmt w:val="bullet"/>
+      <w:lvlText w:val=""/>
+      <w:lvlJc w:val="left"/>
+      <w:pPr>
+        <w:ind w:left="4680" w:hanging="360"/>
+      </w:pPr>
+      <w:rPr>
+        <w:rFonts w:ascii="Symbol" w:hAnsi="Symbol" w:hint="default"/>
+      </w:rPr>
+    </w:lvl>
+    <w:lvl w:ilvl="7" w:tplc="40090003" w:tentative="1">
+      <w:start w:val="1"/>
+      <w:numFmt w:val="bullet"/>
+      <w:lvlText w:val="o"/>
+      <w:lvlJc w:val="left"/>
+      <w:pPr>
+        <w:ind w:left="5400" w:hanging="360"/>
+      </w:pPr>
+      <w:rPr>
+        <w:rFonts w:ascii="Courier New" w:hAnsi="Courier New" w:cs="Courier New" w:hint="default"/>
+      </w:rPr>
+    </w:lvl>
+    <w:lvl w:ilvl="8" w:tplc="40090005" w:tentative="1">
+      <w:start w:val="1"/>
+      <w:numFmt w:val="bullet"/>
+      <w:lvlText w:val=""/>
+      <w:lvlJc w:val="left"/>
+      <w:pPr>
+        <w:ind w:left="6120" w:hanging="360"/>
+      </w:pPr>
+      <w:rPr>
+        <w:rFonts w:ascii="Wingdings" w:hAnsi="Wingdings" w:hint="default"/>
       </w:rPr>
     </w:lvl>
   </w:abstractNum>
@@ -6142,6 +6334,12 @@
   </w:num>
   <w:num w:numId="9" w16cid:durableId="165681775">
     <w:abstractNumId w:val="0"/>
+  </w:num>
+  <w:num w:numId="10" w16cid:durableId="552079572">
+    <w:abstractNumId w:val="10"/>
+  </w:num>
+  <w:num w:numId="11" w16cid:durableId="176846206">
+    <w:abstractNumId w:val="9"/>
   </w:num>
 </w:numbering>
 </file>

</xml_diff>